<commit_message>
fix(doi-buoi): doi lai - P2002 khi duyet -> 409, qua han theo buoi dang hoc, lyDoHuy thay_the chat hon
- duyet: P2002 trong giao dich -> 409 "De nghi da duoc xu ly" (khong 500).
- De nghi doi lai co buoi dang hoc da bat dau = qua han: qua_han, loai khoi
  danh sach cho chinh / dem badge / so_truoc, vao danh sach qua han (1 truy van gop).
- lyDoHuy 'thay_the' chi khi khong co nguoi_xu_ly.
- Huong dan HV: quay ve buoi lop goc = nho ho tro huy duyet (+docx).
Khong migration.

Co-Authored-By: Claude Opus 5.5 <noreply@anthropic.com>
</commit_message>
<xml_diff>
--- a/docs/huong-dan-doi-buoi-hoc-vien.docx
+++ b/docs/huong-dan-doi-buoi-hoc-vien.docx
@@ -877,6 +877,18 @@
       </w:r>
       <w:r>
         <w:t xml:space="preserve"> như đề nghị thường.</w:t>
+      </w:r>
+    </w:p>
+    <w:p>
+      <w:pPr>
+        <w:pStyle w:val="ListParagraph"/>
+        <w:numPr>
+          <w:ilvl w:val="0"/>
+          <w:numId w:val="4"/>
+        </w:numPr>
+      </w:pPr>
+      <w:r>
+        <w:t xml:space="preserve">Muốn quay về học buổi của lớp gốc: nhắn người hỗ trợ cụm hủy duyệt (trước khi buổi bắt đầu).</w:t>
       </w:r>
     </w:p>
     <w:p>

</xml_diff>